<commit_message>
fix: preserve MAX copies and align bot workflows with owner policy
</commit_message>
<xml_diff>
--- a/docs/Регламент_AEMR-bot_MAX_v8.docx
+++ b/docs/Регламент_AEMR-bot_MAX_v8.docx
@@ -3528,7 +3528,7 @@
         <w:jc w:val="both"/>
       </w:pPr>
       <w:r>
-        <w:t>91. Отзыв согласия выполняется жителем в меню «Настройки и помощь» → «Уйти из бота» → «Отозвать согласие». Новые сообщения без нового согласия не принимаются, подписка отключается, текущий диалог и черновик анкеты очищаются. Автоматическая отправка ответов через Чат-бот после отзыва блокируется. Ранее поданные открытые сообщения сохраняются до правовой оценки и очистки. Самостоятельное законное основание продолжения не настроено и не доказано самим наличием карточки; уполномоченное лицо оценивает конкретный случай и при наличии основания организует дальнейшую работу через официальный канал вне Чат-бота. Кнопка «Удалить данные» в том же меню и служебная операция /erase запускают немедленную очистку рабочей базы: закрывают открытые обращения, удаляют запись жителя, содержимое, адреса, вложения, черновики и попытки ответов; оставшиеся записи обращений связываются с общей технической записью. Для известных учтенных сообщений MAX подготавливается очередь удаления, неопределенные исходы сверяются вручную. Незавершенная очистка известных резервных копий блокирует новые снимки. Исторические копии без идентификатора, скачанные файлы, версии внешних объектов и снимки проверяются отдельно по внутренней инструкции. Отзыв или удаление не являются блокировкой за злоупотребления.</w:t>
+        <w:t>91. Отзыв согласия выполняется жителем в меню «Настройки и помощь» → «Уйти из бота» → «Отозвать согласие». Новые сообщения без нового согласия не принимаются, подписка отключается, текущий диалог и черновик анкеты очищаются. Автоматическая отправка ответов через Чат-бот после отзыва блокируется. Ранее поданные открытые сообщения сохраняются до правовой оценки и очистки. Самостоятельное законное основание продолжения не настроено и не доказано самим наличием карточки; уполномоченное лицо оценивает конкретный случай и при наличии основания организует дальнейшую работу через официальный канал вне Чат-бота. Кнопка «Удалить данные» в том же меню и служебная операция /erase запускают немедленную очистку рабочей базы: закрывают открытые обращения, удаляют запись жителя, содержимое, адреса, вложения, черновики и попытки ответов; оставшиеся записи обращений связываются с общей технической записью. Бот не удаляет автоматически сообщения в MAX и ранее выданные выгрузки. Сотрудники вручную проверяют основания хранения, очищают внешние копии и фиксируют результат. Незавершенная очистка известных резервных копий блокирует новые снимки. Исторические копии без идентификатора, скачанные файлы, версии внешних объектов и снимки проверяются отдельно по внутренней инструкции. Отзыв или удаление не являются блокировкой за злоупотребления.</w:t>
       </w:r>
     </w:p>
     <w:p>
@@ -3544,7 +3544,7 @@
         <w:jc w:val="both"/>
       </w:pPr>
       <w:r>
-        <w:t>93. Пять лет — операционный горизонт для работы с сообщениями и оценки принятых мер, а не автоматически применимый архивный срок дела. Нижняя граница очистки определяется по самой поздней из дат: закрытия (при его отсутствии — ответа, иначе — подачи), начала текущего периода при возобновлении и последнего принятия нового обращения в работу. Более поздняя переписка также сдвигает очистку. Принятие нового обращения в работу сохраняется отдельной отметкой и не переносит начало срока первого ответа. Поэтому обращение, поданное шесть лет назад и возобновленное сегодня, не очищается по старой дате подачи. Задача очищает текст, адрес и сведения о вложениях, сохраняя часть метаданных, и запрашивает очистку известных копий через инвентарь удаления и процедуру резервных копий. Известные сообщения MAX ставятся в очередь; подтвержденный результат и незавершенные действия различаются. Неизвестные исторические идентификаторы, скачанные файлы, хранение платформой MAX, версии S3, внешние снимки и журналы хоста требуют отдельной проверки. Возможность повторной идентификации по остаткам оценивается отдельно. Достижение цели, отзыв и другие основания могут требовать более раннего удаления. Архивный срок и номенклатура определяются по фактическому виду документа и применимому перечню; одной аналогии с обращениями по Федеральному закону № 59-ФЗ недостаточно.</w:t>
+        <w:t>93. Пять лет — операционный горизонт для работы с сообщениями и оценки принятых мер, а не автоматически применимый архивный срок дела. Нижняя граница очистки определяется по самой поздней из дат: закрытия (при его отсутствии — ответа, иначе — подачи), начала текущего периода при возобновлении и последнего принятия нового обращения в работу. Более поздняя переписка также сдвигает очистку. Принятие нового обращения в работу сохраняется отдельной отметкой и не переносит начало срока первого ответа. Поэтому обращение, поданное шесть лет назад и возобновленное сегодня, не очищается по старой дате подачи. Задача очищает текст, адрес и сведения о вложениях, сохраняя часть метаданных, и запускает очистку распознанных локальных резервных копий. Сообщения MAX и ранее выданные выгрузки бот автоматически не удаляет. Внешние копии, скачанные файлы, хранение платформой MAX, внешние снимки и журналы хоста уполномоченные сотрудники проверяют и очищают вручную по внутренней инструкции; подтвержденный результат и незавершенные действия фиксируются отдельно. Возможность повторной идентификации по остаткам оценивается отдельно. Достижение цели, отзыв и другие основания могут требовать более раннего удаления. Архивный срок и номенклатура определяются по фактическому виду документа и применимому перечню; одной аналогии с обращениями по Федеральному закону № 59-ФЗ недостаточно.</w:t>
       </w:r>
     </w:p>
     <w:p>
@@ -6078,15 +6078,15 @@
         <w:jc w:val="both"/>
       </w:pPr>
       <w:r>
-        <w:t>114. Локальная ротация резервных копий сохраняет последние BACKUP_KEEP_COUNT файлов по времени изменения (по умолчанию восемь). При еженедельном успешном копировании это приблизительно два месяца истории, но не гарантированный максимальный возраст копии: при простое старые копии остаются. Выгрузка во внешнее объектное хранилище выполняет копирование; удаление и версии объектов регулируются отдельной политикой хранения. Внеплановая копия создается специалистом с ролью «it» через /backup. Отсутствие BACKUP_LOCAL_DIR означает отключенное резервное копирование.</w:t>
-      </w:r>
-    </w:p>
-    <w:p>
-      <w:pPr>
-        <w:jc w:val="both"/>
-      </w:pPr>
-      <w:r>
-        <w:t>115. При возникновении сбоя еженедельного резервного копирования Чат-бот направляет в служебную группу уведомление с указанием стадии сбоя (снятие дампа базы данных, шифрование, доставка во внешнее хранилище). В случае сбоя на стадии шифрования незашифрованный файл резервной копии, оставшийся на сервере, автоматически удаляется в целях недопущения хранения персональных данных в незашифрованном виде.</w:t>
+        <w:t>114. Локальная ротация резервных копий сохраняет последние BACKUP_KEEP_COUNT файлов по времени изменения (по умолчанию восемь). При еженедельном успешном копировании это приблизительно два месяца истории, но не гарантированный максимальный возраст копии: при простое старые копии остаются. S3 и автоматическая выгрузка во внешнее хранилище не используются. Зашифрованные копии сотрудник вручную выносит на отдельный носитель и очищает по установленным основаниям. Внеплановая копия создается специалистом с ролью «it» через /backup. Отсутствие BACKUP_LOCAL_DIR означает отключенное резервное копирование.</w:t>
+      </w:r>
+    </w:p>
+    <w:p>
+      <w:pPr>
+        <w:jc w:val="both"/>
+      </w:pPr>
+      <w:r>
+        <w:t>115. При возникновении сбоя еженедельного резервного копирования Чат-бот направляет в служебную группу уведомление с указанием стадии сбоя (снятие дампа базы данных, шифрование, сохранение локального файла). В случае сбоя на стадии шифрования незашифрованный файл резервной копии, оставшийся на сервере, автоматически удаляется в целях недопущения хранения персональных данных в незашифрованном виде.</w:t>
       </w:r>
     </w:p>
     <w:p>
@@ -6110,7 +6110,7 @@
         <w:jc w:val="both"/>
       </w:pPr>
       <w:r>
-        <w:t>118. Плановая ротация секретов Чат-бота (токен бота, пароль базы данных, парольная фраза шифрования резервных копий, при наличии — секрет веб-перехватчика, реквизиты объектного хранилища, токены доступа к репозиторию, ключи для автоматического развертывания) выполняется специалистом с ролью «it» не реже одного раза в шесть календарных месяцев. Каждый факт ротации фиксируется в журнале эксплуатации отдела цифрового развития. Внеплановая ротация выполняется немедленно при наличии оснований полагать компрометацию (увольнение сотрудника, имевшего доступ к секретам; обнаружение секрета в постороннем канале; компрометация рабочего устройства специалиста с ролью «it»). При ротации парольной фразы шифрования резервных копий прежняя парольная фраза сохраняется в защищенном хранилище паролей до полного выпадения из ротации всех резервных копий, зашифрованных прежней фразой (срок определяется по фактическому наличию копий во всех хранилищах; восемь файлов не гарантируют двухмесячный возраст).</w:t>
+        <w:t>118. Плановая ротация секретов Чат-бота (токен бота, пароль базы данных, парольная фраза шифрования резервных копий, при наличии — секрет веб-перехватчика, токены доступа к репозиторию, ключи для автоматического развертывания) выполняется специалистом с ролью «it» не реже одного раза в шесть календарных месяцев. Каждый факт ротации фиксируется в журнале эксплуатации отдела цифрового развития. Внеплановая ротация выполняется немедленно при наличии оснований полагать компрометацию (увольнение сотрудника, имевшего доступ к секретам; обнаружение секрета в постороннем канале; компрометация рабочего устройства специалиста с ролью «it»). При ротации парольной фразы шифрования резервных копий прежняя парольная фраза сохраняется в защищенном хранилище паролей до полного выпадения из ротации всех резервных копий, зашифрованных прежней фразой (срок определяется по фактическому наличию копий во всех хранилищах; восемь файлов не гарантируют двухмесячный возраст).</w:t>
       </w:r>
     </w:p>
     <w:p>
@@ -6299,7 +6299,7 @@
         <w:jc w:val="both"/>
       </w:pPr>
       <w:r>
-        <w:t>124. Изменения значений настраиваемых параметров, определяющих содержательную часть Чат-бота (ссылок, текстов о приеме граждан, контактных сведений, перечней тематик и населенных пунктов), могут быть синхронизированы с репозиторием Чат-бота посредством создания запроса на включение изменений (pull request) через раздел «Настройки бота» панели быстрых действий /op_help. Синхронизация обеспечивает фиксацию текущих значений настраиваемых параметров в исходных файлах Чат-бота для последующих автоматических развертываний. Параметры commit_author_name, commit_author_email, welcome_text, consent_text, broadcast_max_images и служебные параметры тихих часов не синхронизируются с репозиторием. Создание запроса на включение изменений фиксируется в журнале действий с типом действия settings_pr_created.</w:t>
+        <w:t>124. Изменения значений настраиваемых параметров, определяющих содержательную часть Чат-бота (ссылок, текстов о приеме граждан, контактных сведений, перечней тематик и населенных пунктов), могут быть синхронизированы с репозиторием Чат-бота посредством создания запроса на включение изменений (pull request) через раздел «Настройки бота» панели быстрых действий /op_help. Синхронизация обеспечивает фиксацию текущих значений настраиваемых параметров в исходных файлах Чат-бота для последующих обновлений, выполняемых специалистом вручную. Параметры commit_author_name, commit_author_email, welcome_text, consent_text, broadcast_max_images и служебные параметры тихих часов не синхронизируются с репозиторием. Создание запроса на включение изменений фиксируется в журнале действий с типом действия settings_pr_created.</w:t>
       </w:r>
     </w:p>
     <w:p>
@@ -6461,7 +6461,7 @@
         <w:jc w:val="both"/>
       </w:pPr>
       <w:r>
-        <w:t>137. Изменения программного кода Чат-бота, прошедшие проверку кода и включенные в основную ветку канонического репозитория, автоматически применяются на серверном оборудовании Чат-бота в течение 10 (десяти) минут после включения. Применение выполняется автоматизированной процедурой с предварительной фиксацией текущей версии, пересборкой компонентов и проверкой работоспособности (эндпоинт /livez). При сбое проверки работоспособности происходит автоматический откат на предыдущую версию с уведомлением в системный журнал. Специалист с ролью «it» контролирует факт успешного применения изменений (сигнал жизни в служебной группе).</w:t>
+        <w:t>137. Изменения программного кода Чат-бота, прошедшие проверку и включенные в основную ветку репозитория, применяет на сервере специалист с ролью «it» вручную. Публикация в репозитории не означает развертывание. До обновления фиксируется текущая версия; после запуска проверяются /livez, /readyz и критические сценарии. При сбое специалист восстанавливает предыдущую версию и фиксирует результат в журнале эксплуатации. Автоматизированный сценарий остается альтернативой по решению владельца; наличие в репозитории не подтверждает его установку.</w:t>
       </w:r>
     </w:p>
     <w:p>

</xml_diff>